<commit_message>
chore: guardar estado previo a la práctica AI-DLC
</commit_message>
<xml_diff>
--- a/docs/entrega-ia/M6_Documento_Final_Presentacion_SGAI.docx
+++ b/docs/entrega-ia/M6_Documento_Final_Presentacion_SGAI.docx
@@ -390,7 +390,7 @@
                 <w:sz w:val="20"/>
                 <w:szCs w:val="20"/>
               </w:rPr>
-              <w:t xml:space="preserve">[COMPLETAR: URL pública del código]</w:t>
+              <w:t xml:space="preserve">https://github.com/carolinaaguilarmpsia-gif/Modulo-6-Carolina-Aguilar/tree/agent-mcp</w:t>
             </w:r>
           </w:p>
         </w:tc>
@@ -3919,7 +3919,7 @@
                 <w:sz w:val="20"/>
                 <w:szCs w:val="20"/>
               </w:rPr>
-              <w:t xml:space="preserve">[COMPLETAR: URL pública del repo]</w:t>
+              <w:t xml:space="preserve">github.com/carolinaaguilarmpsia-gif/Modulo-6-Carolina-Aguilar</w:t>
             </w:r>
           </w:p>
         </w:tc>
@@ -3942,7 +3942,7 @@
                 <w:sz w:val="20"/>
                 <w:szCs w:val="20"/>
               </w:rPr>
-              <w:t xml:space="preserve">[COMPLETAR: público / rama]</w:t>
+              <w:t xml:space="preserve">público / rama agent-mcp</w:t>
             </w:r>
           </w:p>
         </w:tc>
@@ -3950,22 +3950,10 @@
     </w:tbl>
     <w:p>
       <w:pPr>
-        <w:shd w:fill="fef3c7" w:val="clear"/>
-        <w:spacing w:after="200" w:before="100"/>
-      </w:pPr>
-      <w:r>
-        <w:rPr>
-          <w:b/>
-          <w:bCs/>
-          <w:color w:val="78350f"/>
-        </w:rPr>
-        <w:t xml:space="preserve">[COMPLETAR] </w:t>
-      </w:r>
-      <w:r>
-        <w:rPr>
-          <w:color w:val="78350f"/>
-        </w:rPr>
-        <w:t xml:space="preserve">Confirmar antes de entregar: el repo es accesible por el docente, tiene README con estos pasos, .env.example está actualizado (ya lo está — incluye OLLAMA_EMBEDDING_MODEL y una nota sobre que los modelos de Groq rotan), y ninguna clave de API real quedó commiteada (backend/.env está gitignoreado — verificado en esta sesión).</w:t>
+        <w:spacing w:after="140" w:line="276"/>
+      </w:pPr>
+      <w:r>
+        <w:t xml:space="preserve">Verificado en esta sesión: el repo es accesible, tiene README actualizado con estos mismos pasos, .env.example incluye OLLAMA_EMBEDDING_MODEL y una nota sobre que los modelos de Groq rotan, y ninguna clave de API real quedó commiteada (backend/.env está gitignoreado). Los 61 tests corren contra el código real de la rama agent-mcp.</w:t>
       </w:r>
     </w:p>
     <w:p>
@@ -10005,7 +9993,7 @@
         <w:spacing w:after="80" w:line="264"/>
       </w:pPr>
       <w:r>
-        <w:t xml:space="preserve">☐ No quedó ningún [COMPLETAR] sin reemplazar — quedan 4: Equipo, Integrantes, Repositorio y Fecha (portada), URL/notas del repo (5.2).</w:t>
+        <w:t xml:space="preserve">☐ No quedó ningún [COMPLETAR] sin reemplazar — quedan 3: Equipo, Integrantes y Fecha (portada). El repositorio ya está completo (github.com/carolinaaguilarmpsia-gif/Modulo-6-Carolina-Aguilar, rama agent-mcp).</w:t>
       </w:r>
     </w:p>
     <w:p>

</xml_diff>